<commit_message>
docs: simplify optimization explanation per document comments
</commit_message>
<xml_diff>
--- a/资料/实验报告/现有优化主线_数学描述与流程_20261008.docx
+++ b/资料/实验报告/现有优化主线_数学描述与流程_20261008.docx
@@ -12,7 +12,7 @@
     </w:p>
     <w:p>
       <w:r>
-        <w:t>当前使用360帧PMPose双鱼眼观测，以reference25权重拟合SMPL-H身体，再拟合WiLoR局部手姿。相机标定、人体模型及VPoser网络固定，优化人体参数。整个过程为离线分阶段拟合。</w:t>
+        <w:t>利用双鱼眼二维关键点得到三维观测，通过连续权重拟合SMPL-H身体，再依据WiLoR局部旋转拟合手姿。相机标定、人体模型和VPoser网络固定，分阶段优化体型、身体姿态、位置和手部姿态。</w:t>
       </w:r>
     </w:p>
     <w:p>
@@ -225,14 +225,8 @@
             <w:shd w:val="clear" w:fill="FFFFFF"/>
           </w:tcPr>
           <w:p>
-            <w:pPr>
-              <w:spacing w:before="60" w:after="60"/>
-            </w:pPr>
             <w:r>
-              <w:rPr>
-                <w:sz w:val="19"/>
-              </w:rPr>
-              <w:t>各360×3</w:t>
+              <w:t>各N×3</w:t>
             </w:r>
           </w:p>
         </w:tc>
@@ -299,14 +293,8 @@
             <w:shd w:val="clear" w:fill="FFFFFF"/>
           </w:tcPr>
           <w:p>
-            <w:pPr>
-              <w:spacing w:before="60" w:after="60"/>
-            </w:pPr>
             <w:r>
-              <w:rPr>
-                <w:sz w:val="19"/>
-              </w:rPr>
-              <w:t>360×32</w:t>
+              <w:t>N×32</w:t>
             </w:r>
           </w:p>
         </w:tc>
@@ -806,7 +794,7 @@
     </w:p>
     <w:p>
       <w:r>
-        <w:t>二维点先回到原始鱼眼像素，经反畸变及DLT三角化得到左相机系三维点Xₜⱼ，再由mm转为m。有效掩码Mₜⱼ要求原图内、数值有限、两侧正深度及非平行射线。身体拟合采用软候选，Stage分支另用严格双目点。</w:t>
+        <w:t>二维点先回到原始鱼眼像素，经反畸变及DLT三角化得到左相机系三维点Xₜⱼ，再由mm转为m。有效掩码Mₜⱼ要求原图内、数值有限、两侧正深度及非平行射线。身体拟合使用连续加权的三维候选，地面位姿估计使用严格双目点。</w:t>
       </w:r>
     </w:p>
     <w:p>
@@ -1086,17 +1074,16 @@
     </w:p>
     <w:p>
       <w:r>
-        <w:t>有效候选中同步项和深度项均为1，故上式省略。25px、80mm以内不做几何降权，超过后按四次尾部连续衰减；拒绝点保持零权重。原质量body_quality与实际权重body_fit_weights分开保存。</w:t>
+        <w:t>回投影误差在25px以内、射线间距在80mm以内时，保留置信度给出的权重；超过后按四次尾部连续衰减。</w:t>
       </w:r>
     </w:p>
     <w:p>
-      <w:r>
-        <w:br w:type="page"/>
-      </w:r>
+      <w:r/>
     </w:p>
     <w:p>
       <w:pPr>
         <w:pStyle w:val="Heading1"/>
+        <w:pageBreakBefore/>
       </w:pPr>
       <w:r>
         <w:t>目标函数与初始化</w:t>
@@ -1112,7 +1099,7 @@
     </w:p>
     <w:p>
       <w:r>
-        <w:t>N=360。Cₜⱼ为模型COCO点，Xₜⱼ为三维候选，二者单位均为m。身体数据项为全片加权平方残差：</w:t>
+        <w:t>N为参与拟合的帧数。Cₜⱼ为模型COCO点，Xₜⱼ为三维候选，二者单位均为m。身体数据项为全片加权平方残差：</w:t>
       </w:r>
     </w:p>
     <w:p>
@@ -1719,25 +1706,7 @@
               <w:rPr>
                 <w:sz w:val="24"/>
               </w:rPr>
-              <m:t>A</m:t>
-            </m:r>
-          </m:sub>
-        </m:sSub>
-        <m:sSub>
-          <m:e>
-            <m:r>
-              <w:rPr>
-                <w:sz w:val="24"/>
-              </w:rPr>
-              <m:t>=L</m:t>
-            </m:r>
-          </m:e>
-          <m:sub>
-            <m:r>
-              <w:rPr>
-                <w:sz w:val="24"/>
-              </w:rPr>
-              <m:t>B</m:t>
+              <m:t>身体</m:t>
             </m:r>
           </m:sub>
         </m:sSub>
@@ -1823,7 +1792,7 @@
               <w:rPr>
                 <w:sz w:val="24"/>
               </w:rPr>
-              <m:t>C</m:t>
+              <m:t>联合</m:t>
             </m:r>
           </m:sub>
         </m:sSub>
@@ -1841,43 +1810,7 @@
               <w:rPr>
                 <w:sz w:val="24"/>
               </w:rPr>
-              <m:t>3D</m:t>
-            </m:r>
-          </m:sub>
-        </m:sSub>
-        <m:sSub>
-          <m:e>
-            <m:r>
-              <w:rPr>
-                <w:sz w:val="24"/>
-              </w:rPr>
-              <m:t>+0.02L</m:t>
-            </m:r>
-          </m:e>
-          <m:sub>
-            <m:r>
-              <w:rPr>
-                <w:sz w:val="24"/>
-              </w:rPr>
-              <m:t>z</m:t>
-            </m:r>
-          </m:sub>
-        </m:sSub>
-        <m:sSub>
-          <m:e>
-            <m:r>
-              <w:rPr>
-                <w:sz w:val="24"/>
-              </w:rPr>
-              <m:t>+0.001L</m:t>
-            </m:r>
-          </m:e>
-          <m:sub>
-            <m:r>
-              <w:rPr>
-                <w:sz w:val="24"/>
-              </w:rPr>
-              <m:t>β</m:t>
+              <m:t>身体</m:t>
             </m:r>
           </m:sub>
         </m:sSub>
@@ -1909,7 +1842,7 @@
     </w:p>
     <w:p>
       <w:r>
-        <w:t>Lr限制根轴角偏离各帧初值，不是时间平滑或SO(3)测地距离。冻结参数的正则项为常数。当前身体二维重投影、身体时序、人工腕位置、模板骨长与表面接触项均关闭。</w:t>
+        <w:t>Lr按各帧根轴角与初值的平方差计算。位置与姿态拟合、体型拟合使用式(7)，身体联合拟合在此基础上加入根方向约束，见式(8)。</w:t>
       </w:r>
     </w:p>
     <w:p>
@@ -2279,7 +2212,7 @@
     </w:p>
     <w:p>
       <w:r>
-        <w:t>C̃来自初始化旋转后的模板。要求所有帧肩髋基底有效，初始等权身体RMS≤300mm；本次为145.61mm。A/B/C中手系数为零，WiLoR手初值在D1开始时注入。</w:t>
+        <w:t>C̃来自初始化旋转后的模板。各帧均构造有效的肩髋基底，并检查初始身体RMS≤300mm。身体拟合完成后，将WiLoR局部旋转投影到PCA空间，按全片观测权重平均，得到共享手姿初值。</w:t>
       </w:r>
     </w:p>
     <w:p>
@@ -2761,7 +2694,7 @@
               <w:rPr>
                 <w:sz w:val="24"/>
               </w:rPr>
-              <m:t>D</m:t>
+              <m:t>手姿</m:t>
             </m:r>
           </m:sub>
         </m:sSub>
@@ -2965,17 +2898,16 @@
     </w:p>
     <w:p>
       <w:r>
-        <w:t>H为WiLoR父相对局部旋转，b为通过腕—手框关联后的框分数，15关节等权。旋转残差‖R−H‖²F/4=1−cosφ。D1/D2只更新共享手PCA，身体与体型冻结；共享手姿分支的时序项为0。</w:t>
+        <w:t>H为WiLoR父相对局部旋转，b为腕点与手框关联后的框分数，15个关节等权。旋转残差‖R−H‖²F/4=1−cosφ。手姿拟合时，更新两只手的共享PCA系数，保持身体姿态和体型固定。</w:t>
       </w:r>
     </w:p>
     <w:p>
-      <w:r>
-        <w:br w:type="page"/>
-      </w:r>
+      <w:r/>
     </w:p>
     <w:p>
       <w:pPr>
         <w:pStyle w:val="Heading1"/>
+        <w:pageBreakBefore/>
       </w:pPr>
       <w:r>
         <w:t>优化流程与场景变换</w:t>
@@ -2996,10 +2928,10 @@
         <w:tblLook w:firstColumn="1" w:firstRow="1" w:lastColumn="0" w:lastRow="0" w:noHBand="0" w:noVBand="1" w:val="04A0"/>
       </w:tblPr>
       <w:tblGrid>
-        <w:gridCol w:w="2353"/>
-        <w:gridCol w:w="2353"/>
-        <w:gridCol w:w="2353"/>
-        <w:gridCol w:w="2353"/>
+        <w:gridCol w:w="1701"/>
+        <w:gridCol w:w="850"/>
+        <w:gridCol w:w="4479"/>
+        <w:gridCol w:w="2268"/>
       </w:tblGrid>
       <w:tr>
         <w:trPr>
@@ -3008,7 +2940,7 @@
         </w:trPr>
         <w:tc>
           <w:tcPr>
-            <w:tcW w:type="dxa" w:w="1134"/>
+            <w:tcW w:type="dxa" w:w="1701"/>
             <w:tcBorders>
               <w:top w:val="single" w:sz="4" w:color="000000"/>
               <w:left w:val="single" w:sz="4" w:color="000000"/>
@@ -3032,7 +2964,7 @@
         </w:tc>
         <w:tc>
           <w:tcPr>
-            <w:tcW w:type="dxa" w:w="1134"/>
+            <w:tcW w:type="dxa" w:w="850"/>
             <w:tcBorders>
               <w:top w:val="single" w:sz="4" w:color="000000"/>
               <w:left w:val="single" w:sz="4" w:color="000000"/>
@@ -3056,7 +2988,7 @@
         </w:tc>
         <w:tc>
           <w:tcPr>
-            <w:tcW w:type="dxa" w:w="4535"/>
+            <w:tcW w:type="dxa" w:w="4479"/>
             <w:tcBorders>
               <w:top w:val="single" w:sz="4" w:color="000000"/>
               <w:left w:val="single" w:sz="4" w:color="000000"/>
@@ -3080,7 +3012,7 @@
         </w:tc>
         <w:tc>
           <w:tcPr>
-            <w:tcW w:type="dxa" w:w="2494"/>
+            <w:tcW w:type="dxa" w:w="2268"/>
             <w:tcBorders>
               <w:top w:val="single" w:sz="4" w:color="000000"/>
               <w:left w:val="single" w:sz="4" w:color="000000"/>
@@ -3109,7 +3041,7 @@
         </w:trPr>
         <w:tc>
           <w:tcPr>
-            <w:tcW w:type="dxa" w:w="1134"/>
+            <w:tcW w:type="dxa" w:w="1701"/>
             <w:tcBorders>
               <w:top w:val="single" w:sz="4" w:color="000000"/>
               <w:left w:val="single" w:sz="4" w:color="000000"/>
@@ -3119,20 +3051,14 @@
             <w:shd w:val="clear" w:fill="FFFFFF"/>
           </w:tcPr>
           <w:p>
-            <w:pPr>
-              <w:spacing w:before="60" w:after="60"/>
-            </w:pPr>
             <w:r>
-              <w:rPr>
-                <w:sz w:val="19"/>
-              </w:rPr>
-              <w:t>A</w:t>
+              <w:t>位置与姿态</w:t>
             </w:r>
           </w:p>
         </w:tc>
         <w:tc>
           <w:tcPr>
-            <w:tcW w:type="dxa" w:w="1134"/>
+            <w:tcW w:type="dxa" w:w="850"/>
             <w:tcBorders>
               <w:top w:val="single" w:sz="4" w:color="000000"/>
               <w:left w:val="single" w:sz="4" w:color="000000"/>
@@ -3155,7 +3081,7 @@
         </w:tc>
         <w:tc>
           <w:tcPr>
-            <w:tcW w:type="dxa" w:w="4535"/>
+            <w:tcW w:type="dxa" w:w="4479"/>
             <w:tcBorders>
               <w:top w:val="single" w:sz="4" w:color="000000"/>
               <w:left w:val="single" w:sz="4" w:color="000000"/>
@@ -3178,7 +3104,7 @@
         </w:tc>
         <w:tc>
           <w:tcPr>
-            <w:tcW w:type="dxa" w:w="2494"/>
+            <w:tcW w:type="dxa" w:w="2268"/>
             <w:tcBorders>
               <w:top w:val="single" w:sz="4" w:color="000000"/>
               <w:left w:val="single" w:sz="4" w:color="000000"/>
@@ -3206,7 +3132,7 @@
         </w:trPr>
         <w:tc>
           <w:tcPr>
-            <w:tcW w:type="dxa" w:w="1134"/>
+            <w:tcW w:type="dxa" w:w="1701"/>
             <w:tcBorders>
               <w:top w:val="single" w:sz="4" w:color="000000"/>
               <w:left w:val="single" w:sz="4" w:color="000000"/>
@@ -3216,20 +3142,14 @@
             <w:shd w:val="clear" w:fill="FFFFFF"/>
           </w:tcPr>
           <w:p>
-            <w:pPr>
-              <w:spacing w:before="60" w:after="60"/>
-            </w:pPr>
             <w:r>
-              <w:rPr>
-                <w:sz w:val="19"/>
-              </w:rPr>
-              <w:t>B</w:t>
+              <w:t>体型</w:t>
             </w:r>
           </w:p>
         </w:tc>
         <w:tc>
           <w:tcPr>
-            <w:tcW w:type="dxa" w:w="1134"/>
+            <w:tcW w:type="dxa" w:w="850"/>
             <w:tcBorders>
               <w:top w:val="single" w:sz="4" w:color="000000"/>
               <w:left w:val="single" w:sz="4" w:color="000000"/>
@@ -3252,7 +3172,7 @@
         </w:tc>
         <w:tc>
           <w:tcPr>
-            <w:tcW w:type="dxa" w:w="4535"/>
+            <w:tcW w:type="dxa" w:w="4479"/>
             <w:tcBorders>
               <w:top w:val="single" w:sz="4" w:color="000000"/>
               <w:left w:val="single" w:sz="4" w:color="000000"/>
@@ -3275,7 +3195,7 @@
         </w:tc>
         <w:tc>
           <w:tcPr>
-            <w:tcW w:type="dxa" w:w="2494"/>
+            <w:tcW w:type="dxa" w:w="2268"/>
             <w:tcBorders>
               <w:top w:val="single" w:sz="4" w:color="000000"/>
               <w:left w:val="single" w:sz="4" w:color="000000"/>
@@ -3303,7 +3223,7 @@
         </w:trPr>
         <w:tc>
           <w:tcPr>
-            <w:tcW w:type="dxa" w:w="1134"/>
+            <w:tcW w:type="dxa" w:w="1701"/>
             <w:tcBorders>
               <w:top w:val="single" w:sz="4" w:color="000000"/>
               <w:left w:val="single" w:sz="4" w:color="000000"/>
@@ -3313,20 +3233,14 @@
             <w:shd w:val="clear" w:fill="FFFFFF"/>
           </w:tcPr>
           <w:p>
-            <w:pPr>
-              <w:spacing w:before="60" w:after="60"/>
-            </w:pPr>
             <w:r>
-              <w:rPr>
-                <w:sz w:val="19"/>
-              </w:rPr>
-              <w:t>C</w:t>
+              <w:t>身体联合</w:t>
             </w:r>
           </w:p>
         </w:tc>
         <w:tc>
           <w:tcPr>
-            <w:tcW w:type="dxa" w:w="1134"/>
+            <w:tcW w:type="dxa" w:w="850"/>
             <w:tcBorders>
               <w:top w:val="single" w:sz="4" w:color="000000"/>
               <w:left w:val="single" w:sz="4" w:color="000000"/>
@@ -3349,7 +3263,7 @@
         </w:tc>
         <w:tc>
           <w:tcPr>
-            <w:tcW w:type="dxa" w:w="4535"/>
+            <w:tcW w:type="dxa" w:w="4479"/>
             <w:tcBorders>
               <w:top w:val="single" w:sz="4" w:color="000000"/>
               <w:left w:val="single" w:sz="4" w:color="000000"/>
@@ -3372,7 +3286,7 @@
         </w:tc>
         <w:tc>
           <w:tcPr>
-            <w:tcW w:type="dxa" w:w="2494"/>
+            <w:tcW w:type="dxa" w:w="2268"/>
             <w:tcBorders>
               <w:top w:val="single" w:sz="4" w:color="000000"/>
               <w:left w:val="single" w:sz="4" w:color="000000"/>
@@ -3400,7 +3314,7 @@
         </w:trPr>
         <w:tc>
           <w:tcPr>
-            <w:tcW w:type="dxa" w:w="1134"/>
+            <w:tcW w:type="dxa" w:w="1701"/>
             <w:tcBorders>
               <w:top w:val="single" w:sz="4" w:color="000000"/>
               <w:left w:val="single" w:sz="4" w:color="000000"/>
@@ -3410,20 +3324,14 @@
             <w:shd w:val="clear" w:fill="FFFFFF"/>
           </w:tcPr>
           <w:p>
-            <w:pPr>
-              <w:spacing w:before="60" w:after="60"/>
-            </w:pPr>
             <w:r>
-              <w:rPr>
-                <w:sz w:val="19"/>
-              </w:rPr>
-              <w:t>D1</w:t>
+              <w:t>手姿初拟合</w:t>
             </w:r>
           </w:p>
         </w:tc>
         <w:tc>
           <w:tcPr>
-            <w:tcW w:type="dxa" w:w="1134"/>
+            <w:tcW w:type="dxa" w:w="850"/>
             <w:tcBorders>
               <w:top w:val="single" w:sz="4" w:color="000000"/>
               <w:left w:val="single" w:sz="4" w:color="000000"/>
@@ -3446,7 +3354,7 @@
         </w:tc>
         <w:tc>
           <w:tcPr>
-            <w:tcW w:type="dxa" w:w="4535"/>
+            <w:tcW w:type="dxa" w:w="4479"/>
             <w:tcBorders>
               <w:top w:val="single" w:sz="4" w:color="000000"/>
               <w:left w:val="single" w:sz="4" w:color="000000"/>
@@ -3469,7 +3377,7 @@
         </w:tc>
         <w:tc>
           <w:tcPr>
-            <w:tcW w:type="dxa" w:w="2494"/>
+            <w:tcW w:type="dxa" w:w="2268"/>
             <w:tcBorders>
               <w:top w:val="single" w:sz="4" w:color="000000"/>
               <w:left w:val="single" w:sz="4" w:color="000000"/>
@@ -3497,7 +3405,7 @@
         </w:trPr>
         <w:tc>
           <w:tcPr>
-            <w:tcW w:type="dxa" w:w="1134"/>
+            <w:tcW w:type="dxa" w:w="1701"/>
             <w:tcBorders>
               <w:top w:val="single" w:sz="4" w:color="000000"/>
               <w:left w:val="single" w:sz="4" w:color="000000"/>
@@ -3507,20 +3415,14 @@
             <w:shd w:val="clear" w:fill="FFFFFF"/>
           </w:tcPr>
           <w:p>
-            <w:pPr>
-              <w:spacing w:before="60" w:after="60"/>
-            </w:pPr>
             <w:r>
-              <w:rPr>
-                <w:sz w:val="19"/>
-              </w:rPr>
-              <w:t>D2</w:t>
+              <w:t>手姿细化</w:t>
             </w:r>
           </w:p>
         </w:tc>
         <w:tc>
           <w:tcPr>
-            <w:tcW w:type="dxa" w:w="1134"/>
+            <w:tcW w:type="dxa" w:w="850"/>
             <w:tcBorders>
               <w:top w:val="single" w:sz="4" w:color="000000"/>
               <w:left w:val="single" w:sz="4" w:color="000000"/>
@@ -3543,7 +3445,7 @@
         </w:tc>
         <w:tc>
           <w:tcPr>
-            <w:tcW w:type="dxa" w:w="4535"/>
+            <w:tcW w:type="dxa" w:w="4479"/>
             <w:tcBorders>
               <w:top w:val="single" w:sz="4" w:color="000000"/>
               <w:left w:val="single" w:sz="4" w:color="000000"/>
@@ -3566,7 +3468,7 @@
         </w:tc>
         <w:tc>
           <w:tcPr>
-            <w:tcW w:type="dxa" w:w="2494"/>
+            <w:tcW w:type="dxa" w:w="2268"/>
             <w:tcBorders>
               <w:top w:val="single" w:sz="4" w:color="000000"/>
               <w:left w:val="single" w:sz="4" w:color="000000"/>
@@ -3588,112 +3490,15 @@
           </w:p>
         </w:tc>
       </w:tr>
-      <w:tr>
-        <w:trPr>
-          <w:cantSplit/>
-        </w:trPr>
-        <w:tc>
-          <w:tcPr>
-            <w:tcW w:type="dxa" w:w="1134"/>
-            <w:tcBorders>
-              <w:top w:val="single" w:sz="4" w:color="000000"/>
-              <w:left w:val="single" w:sz="4" w:color="000000"/>
-              <w:bottom w:val="single" w:sz="4" w:color="000000"/>
-              <w:right w:val="single" w:sz="4" w:color="000000"/>
-            </w:tcBorders>
-            <w:shd w:val="clear" w:fill="FFFFFF"/>
-          </w:tcPr>
-          <w:p>
-            <w:pPr>
-              <w:spacing w:before="60" w:after="60"/>
-            </w:pPr>
-            <w:r>
-              <w:rPr>
-                <w:sz w:val="19"/>
-              </w:rPr>
-              <w:t>D3</w:t>
-            </w:r>
-          </w:p>
-        </w:tc>
-        <w:tc>
-          <w:tcPr>
-            <w:tcW w:type="dxa" w:w="1134"/>
-            <w:tcBorders>
-              <w:top w:val="single" w:sz="4" w:color="000000"/>
-              <w:left w:val="single" w:sz="4" w:color="000000"/>
-              <w:bottom w:val="single" w:sz="4" w:color="000000"/>
-              <w:right w:val="single" w:sz="4" w:color="000000"/>
-            </w:tcBorders>
-            <w:shd w:val="clear" w:fill="FFFFFF"/>
-          </w:tcPr>
-          <w:p>
-            <w:pPr>
-              <w:spacing w:before="60" w:after="60"/>
-            </w:pPr>
-            <w:r>
-              <w:rPr>
-                <w:sz w:val="19"/>
-              </w:rPr>
-              <w:t>0</w:t>
-            </w:r>
-          </w:p>
-        </w:tc>
-        <w:tc>
-          <w:tcPr>
-            <w:tcW w:type="dxa" w:w="4535"/>
-            <w:tcBorders>
-              <w:top w:val="single" w:sz="4" w:color="000000"/>
-              <w:left w:val="single" w:sz="4" w:color="000000"/>
-              <w:bottom w:val="single" w:sz="4" w:color="000000"/>
-              <w:right w:val="single" w:sz="4" w:color="000000"/>
-            </w:tcBorders>
-            <w:shd w:val="clear" w:fill="FFFFFF"/>
-          </w:tcPr>
-          <w:p>
-            <w:pPr>
-              <w:spacing w:before="60" w:after="60"/>
-            </w:pPr>
-            <w:r>
-              <w:rPr>
-                <w:sz w:val="19"/>
-              </w:rPr>
-              <w:t>无接触输入，跳过</w:t>
-            </w:r>
-          </w:p>
-        </w:tc>
-        <w:tc>
-          <w:tcPr>
-            <w:tcW w:type="dxa" w:w="2494"/>
-            <w:tcBorders>
-              <w:top w:val="single" w:sz="4" w:color="000000"/>
-              <w:left w:val="single" w:sz="4" w:color="000000"/>
-              <w:bottom w:val="single" w:sz="4" w:color="000000"/>
-              <w:right w:val="single" w:sz="4" w:color="000000"/>
-            </w:tcBorders>
-            <w:shd w:val="clear" w:fill="FFFFFF"/>
-          </w:tcPr>
-          <w:p>
-            <w:pPr>
-              <w:spacing w:before="60" w:after="60"/>
-            </w:pPr>
-            <w:r>
-              <w:rPr>
-                <w:sz w:val="19"/>
-              </w:rPr>
-              <w:t>—</w:t>
-            </w:r>
-          </w:p>
-        </w:tc>
-      </w:tr>
     </w:tbl>
     <w:p>
       <w:r>
-        <w:t>流程：输入与掩码核对 → 冷初始化 → A位置/姿态 → B体型 → C联合身体 → 冻结身体与β → D1/D2手姿 → 保存参数、网格和审计。共560次全序列更新，每次处理360帧。</w:t>
+        <w:t>先由当前观测初始化人体，再依次拟合位置与姿态、体型，随后联合调整身体参数；身体拟合完成后，分两次优化共享手姿。共560次更新，每次使用全部有效观测。</w:t>
       </w:r>
     </w:p>
     <w:p>
       <w:r>
-        <w:t>每阶段重新建立Adam；清梯度、模型前向、计算当前损失、反向传播，再更新被释放的参数。各阶段使用固定学习率；Adam默认动量为0.9/0.999，ε=10⁻⁸，无weight decay。</w:t>
+        <w:t>每阶段重新建立Adam，依次清梯度、模型前向、计算损失、反向传播和参数更新。各阶段采用固定学习率，Adam动量系数为0.9和0.999，ε=10⁻⁸。</w:t>
       </w:r>
     </w:p>
     <w:p>
@@ -4090,7 +3895,7 @@
     </w:p>
     <w:p>
       <w:r>
-        <w:t>按固定预算结束，不保证每步下降或全局最优。输入错位、初始化超门及非有限损失/梯度/参数时停止，保留失败与拒绝状态。</w:t>
+        <w:t>各阶段按表中步数执行，完成后保存人体参数和网格。</w:t>
       </w:r>
     </w:p>
     <w:p>
@@ -4098,12 +3903,12 @@
         <w:pStyle w:val="Heading2"/>
       </w:pPr>
       <w:r>
-        <w:t>7. 独立的Stage与地面分支</w:t>
+        <w:t>7. 地面坐标变换</w:t>
       </w:r>
     </w:p>
     <w:p>
       <w:r>
-        <w:t>Stage 1保持相机地面位姿并更新踝锚；Stage 2由背景估计旋转，结合严格踝点求平移。设Aₕ为地面系踝锚、pₜₕ为相机系踝点：</w:t>
+        <w:t>人体运动、助步器静止时，保持相机地面位姿并更新踝锚；助步器运动时，由背景估计相机旋转，再结合严格踝点求平移。设Aₕ为地面系踝锚、pₜₕ为相机系踝点：</w:t>
       </w:r>
     </w:p>
     <w:p>
@@ -4306,28 +4111,7 @@
     </w:p>
     <w:p>
       <w:r>
-        <w:t>A、p、τ用mm，网格V用m。双踝平移差≤60mm时取均值，接受的平移以0.45增益更新；基本平移步长门120mm，旋转步长门5°。人体、助步器及相机使用同帧R/t。该分支不进入身体目标函数。</w:t>
-      </w:r>
-    </w:p>
-    <w:p>
-      <w:pPr>
-        <w:pStyle w:val="Heading2"/>
-      </w:pPr>
-      <w:r>
-        <w:t>8. 当前结果的解释</w:t>
-      </w:r>
-    </w:p>
-    <w:p>
-      <w:r>
-        <w:t>reference25使肘腕平均观测残差75.12→66.38mm，膝踝二阶差分P95为73.68→41.92mm/frame²；固定旧质量评价的全身RMS则51.10→57.93mm，部分肘腕点变差。这些是内部一致性及帧间变化指标；当前没有独立三维或物理接触验证。共享手姿也不保证腕位置固定或抓握成立。</w:t>
-      </w:r>
-    </w:p>
-    <w:p>
-      <w:r>
-        <w:rPr>
-          <w:sz w:val="17"/>
-        </w:rPr>
-        <w:t>参数依据：current_mainline.json中的mainline_selection；G20261005_reference_weight_fit_v1/runs/reference25/resolved_options.json。实现：pose_app/smplh_fitting/{pipeline,losses,stages,initialization}.py及wilor_mano_prior.py（均位于realtime_app下）。</w:t>
+        <w:t>A、p、τ用mm，网格V用m。双踝推算的平移差≤60mm时取均值，接受的平移以0.45增益更新；基本平移步长门120mm，旋转步长门5°。完成场景位姿估计后，将人体、助步器和相机按同一帧的R/t转换到地面坐标系。</w:t>
       </w:r>
     </w:p>
     <w:sectPr>

</xml_diff>

<commit_message>
docs: explain symbols beside optimization equations
</commit_message>
<xml_diff>
--- a/资料/实验报告/现有优化主线_数学描述与流程_20261008.docx
+++ b/资料/实验报告/现有优化主线_数学描述与流程_20261008.docx
@@ -405,6 +405,7 @@
     <w:p>
       <w:pPr>
         <w:keepLines/>
+        <w:spacing w:after="40" w:line="240" w:lineRule="auto"/>
         <w:jc w:val="center"/>
       </w:pPr>
       <m:oMath>
@@ -653,6 +654,7 @@
     <w:p>
       <w:pPr>
         <w:keepLines/>
+        <w:spacing w:after="40" w:line="240" w:lineRule="auto"/>
         <w:jc w:val="center"/>
       </w:pPr>
       <m:oMath>
@@ -786,6 +788,17 @@
     </w:p>
     <w:p>
       <w:pPr>
+        <w:spacing w:after="60" w:line="240" w:lineRule="auto"/>
+      </w:pPr>
+      <w:r>
+        <w:rPr>
+          <w:sz w:val="20"/>
+        </w:rPr>
+        <w:t>t为帧索引，θₜ为身体关节轴角，Vₜ为人体顶点坐标。D_VP表示VPoser解码函数，M_H表示SMPL-H生成函数，J_COCO为表面到COCO点的回归矩阵。</w:t>
+      </w:r>
+    </w:p>
+    <w:p>
+      <w:pPr>
         <w:pStyle w:val="Heading2"/>
       </w:pPr>
       <w:r>
@@ -805,6 +818,7 @@
     <w:p>
       <w:pPr>
         <w:keepLines/>
+        <w:spacing w:after="40" w:line="240" w:lineRule="auto"/>
         <w:jc w:val="center"/>
       </w:pPr>
       <m:oMath>
@@ -953,6 +967,7 @@
     <w:p>
       <w:pPr>
         <w:keepLines/>
+        <w:spacing w:after="40" w:line="240" w:lineRule="auto"/>
         <w:jc w:val="center"/>
       </w:pPr>
       <m:oMath>
@@ -1073,6 +1088,17 @@
       </w:r>
     </w:p>
     <w:p>
+      <w:pPr>
+        <w:spacing w:after="60" w:line="240" w:lineRule="auto"/>
+      </w:pPr>
+      <w:r>
+        <w:rPr>
+          <w:sz w:val="20"/>
+        </w:rPr>
+        <w:t>cL、cR为左右相机检测分数，s为几何异常程度，h(s)为衰减系数；wₜⱼ为拟合权重，Mₜⱼ为有效掩码，有效点取1，其余取0。j为COCO关键点索引。</w:t>
+      </w:r>
+    </w:p>
+    <w:p>
       <w:r>
         <w:t>回投影误差在25px以内、射线间距在80mm以内时，保留置信度给出的权重；超过后按四次尾部连续衰减。</w:t>
       </w:r>
@@ -1105,6 +1131,7 @@
     <w:p>
       <w:pPr>
         <w:keepLines/>
+        <w:spacing w:after="40" w:line="240" w:lineRule="auto"/>
         <w:jc w:val="center"/>
       </w:pPr>
       <m:oMath>
@@ -1355,6 +1382,7 @@
     <w:p>
       <w:pPr>
         <w:keepLines/>
+        <w:spacing w:after="40" w:line="240" w:lineRule="auto"/>
         <w:jc w:val="center"/>
       </w:pPr>
       <m:oMath>
@@ -1688,7 +1716,19 @@
     </w:p>
     <w:p>
       <w:pPr>
+        <w:spacing w:after="60" w:line="240" w:lineRule="auto"/>
+      </w:pPr>
+      <w:r>
+        <w:rPr>
+          <w:sz w:val="20"/>
+        </w:rPr>
+        <w:t>Lz、Lβ、Lr依次为姿态、体型、根方向正则，rₜ⁰为根轴角初值；‖·‖₂为欧氏范数。</w:t>
+      </w:r>
+    </w:p>
+    <w:p>
+      <w:pPr>
         <w:keepLines/>
+        <w:spacing w:after="40" w:line="240" w:lineRule="auto"/>
         <w:jc w:val="center"/>
       </w:pPr>
       <m:oMath>
@@ -1775,6 +1815,7 @@
     <w:p>
       <w:pPr>
         <w:keepLines/>
+        <w:spacing w:after="40" w:line="240" w:lineRule="auto"/>
         <w:jc w:val="center"/>
       </w:pPr>
       <m:oMath>
@@ -1861,6 +1902,7 @@
     <w:p>
       <w:pPr>
         <w:keepLines/>
+        <w:spacing w:after="40" w:line="240" w:lineRule="auto"/>
         <w:jc w:val="center"/>
       </w:pPr>
       <m:oMath>
@@ -2045,6 +2087,7 @@
     <w:p>
       <w:pPr>
         <w:keepLines/>
+        <w:spacing w:after="40" w:line="240" w:lineRule="auto"/>
         <w:jc w:val="center"/>
       </w:pPr>
       <m:oMath>
@@ -2211,6 +2254,17 @@
       </w:r>
     </w:p>
     <w:p>
+      <w:pPr>
+        <w:spacing w:after="60" w:line="240" w:lineRule="auto"/>
+      </w:pPr>
+      <w:r>
+        <w:rPr>
+          <w:sz w:val="20"/>
+        </w:rPr>
+        <w:t>B的上标obs、template表示观测、模板；上标0表示初值，T表示转置，Log将旋转转为轴角。11、12为左右髋编号。</w:t>
+      </w:r>
+    </w:p>
+    <w:p>
       <w:r>
         <w:t>C̃来自初始化旋转后的模板。各帧均构造有效的肩髋基底，并检查初始身体RMS≤300mm。身体拟合完成后，将WiLoR局部旋转投影到PCA空间，按全片观测权重平均，得到共享手姿初值。</w:t>
       </w:r>
@@ -2231,6 +2285,7 @@
     <w:p>
       <w:pPr>
         <w:keepLines/>
+        <w:spacing w:after="40" w:line="240" w:lineRule="auto"/>
         <w:jc w:val="center"/>
       </w:pPr>
       <m:oMath>
@@ -2389,6 +2444,7 @@
     <w:p>
       <w:pPr>
         <w:keepLines/>
+        <w:spacing w:after="40" w:line="240" w:lineRule="auto"/>
         <w:jc w:val="center"/>
       </w:pPr>
       <m:oMath>
@@ -2677,6 +2733,7 @@
     <w:p>
       <w:pPr>
         <w:keepLines/>
+        <w:spacing w:after="40" w:line="240" w:lineRule="auto"/>
         <w:jc w:val="center"/>
       </w:pPr>
       <m:oMath>
@@ -2894,6 +2951,17 @@
           <w:sz w:val="18"/>
         </w:rPr>
         <w:t xml:space="preserve">  (13)</w:t>
+      </w:r>
+    </w:p>
+    <w:p>
+      <w:pPr>
+        <w:spacing w:after="60" w:line="240" w:lineRule="auto"/>
+      </w:pPr>
+      <w:r>
+        <w:rPr>
+          <w:sz w:val="20"/>
+        </w:rPr>
+        <w:t>h为手侧（L左、R右），v为视角，k为指关节索引；Rₕₖ为模型局部旋转，Lₕ为单手损失。‖·‖F为Frobenius范数，φ为相对旋转角。</w:t>
       </w:r>
     </w:p>
     <w:p>
@@ -3504,6 +3572,7 @@
     <w:p>
       <w:pPr>
         <w:keepLines/>
+        <w:spacing w:after="40" w:line="240" w:lineRule="auto"/>
         <w:jc w:val="center"/>
       </w:pPr>
       <m:oMath>
@@ -3712,6 +3781,7 @@
     <w:p>
       <w:pPr>
         <w:keepLines/>
+        <w:spacing w:after="40" w:line="240" w:lineRule="auto"/>
         <w:jc w:val="center"/>
       </w:pPr>
       <m:oMath>
@@ -3894,6 +3964,17 @@
       </w:r>
     </w:p>
     <w:p>
+      <w:pPr>
+        <w:spacing w:after="60" w:line="240" w:lineRule="auto"/>
+      </w:pPr>
+      <w:r>
+        <w:rPr>
+          <w:sz w:val="20"/>
+        </w:rPr>
+        <w:t>ξ为当前阶段待优化参数，k为迭代次数，gₖ为梯度，mₖ、vₖ为梯度的一阶、二阶动量，η为学习率，ε为数值稳定项。</w:t>
+      </w:r>
+    </w:p>
+    <w:p>
       <w:r>
         <w:t>各阶段按表中步数执行，完成后保存人体参数和网格。</w:t>
       </w:r>
@@ -3914,6 +3995,7 @@
     <w:p>
       <w:pPr>
         <w:keepLines/>
+        <w:spacing w:after="40" w:line="240" w:lineRule="auto"/>
         <w:jc w:val="center"/>
       </w:pPr>
       <m:oMath>
@@ -4107,6 +4189,17 @@
           <w:sz w:val="18"/>
         </w:rPr>
         <w:t xml:space="preserve">  (16)</w:t>
+      </w:r>
+    </w:p>
+    <w:p>
+      <w:pPr>
+        <w:spacing w:after="60" w:line="240" w:lineRule="auto"/>
+      </w:pPr>
+      <w:r>
+        <w:rPr>
+          <w:sz w:val="20"/>
+        </w:rPr>
+        <w:t>Rₜ为相机到地面的旋转，τₜ为相机在地面系中的平移；V的上标C、G分别表示相机坐标系和地面坐标系。</w:t>
       </w:r>
     </w:p>
     <w:p>

</xml_diff>